<commit_message>
add class and choose teacher
</commit_message>
<xml_diff>
--- a/Docs/پروژه.docx
+++ b/Docs/پروژه.docx
@@ -143,6 +143,8 @@
         </w:rPr>
         <w:t>.</w:t>
       </w:r>
+      <w:bookmarkStart w:id="0" w:name="_GoBack"/>
+      <w:bookmarkEnd w:id="0"/>
     </w:p>
     <w:p>
       <w:pPr>
@@ -150,17 +152,20 @@
         <w:bidi/>
         <w:rPr>
           <w:rFonts w:hint="eastAsia"/>
+          <w:highlight w:val="green"/>
         </w:rPr>
       </w:pPr>
       <w:r>
         <w:rPr>
           <w:rFonts w:cs="Times New Roman"/>
+          <w:highlight w:val="green"/>
           <w:rtl/>
         </w:rPr>
         <w:t>مشاهده لیست معلم‌ها و دانش‌آموزان ثبت‌نام کرده و تأیید یا رد ثبت‌نام آن‌ها</w:t>
       </w:r>
       <w:r>
         <w:rPr>
+          <w:highlight w:val="green"/>
           <w:rtl/>
         </w:rPr>
         <w:t>.</w:t>
@@ -228,17 +233,20 @@
         <w:bidi/>
         <w:rPr>
           <w:rFonts w:hint="eastAsia"/>
+          <w:highlight w:val="green"/>
         </w:rPr>
       </w:pPr>
       <w:r>
         <w:rPr>
           <w:rFonts w:cs="Times New Roman"/>
+          <w:highlight w:val="green"/>
           <w:rtl/>
         </w:rPr>
         <w:t>تعریف کلاس جدید و انتخاب معلم برای آن کلاس</w:t>
       </w:r>
       <w:r>
         <w:rPr>
+          <w:highlight w:val="green"/>
           <w:rtl/>
         </w:rPr>
         <w:t>.</w:t>
@@ -546,17 +554,20 @@
         <w:bidi/>
         <w:rPr>
           <w:rFonts w:hint="eastAsia"/>
+          <w:highlight w:val="green"/>
         </w:rPr>
       </w:pPr>
       <w:r>
         <w:rPr>
           <w:rFonts w:cs="Times New Roman"/>
+          <w:highlight w:val="green"/>
           <w:rtl/>
         </w:rPr>
         <w:t xml:space="preserve">مشاهده مدارس نزدیک بر اساس موقعیت مکانی </w:t>
       </w:r>
       <w:r>
         <w:rPr>
+          <w:highlight w:val="green"/>
           <w:rtl/>
         </w:rPr>
         <w:t>(</w:t>
@@ -564,12 +575,14 @@
       <w:r>
         <w:rPr>
           <w:rFonts w:cs="Times New Roman"/>
+          <w:highlight w:val="green"/>
           <w:rtl/>
         </w:rPr>
         <w:t>اختیاری</w:t>
       </w:r>
       <w:r>
         <w:rPr>
+          <w:highlight w:val="green"/>
           <w:rtl/>
         </w:rPr>
         <w:t>).</w:t>
@@ -832,17 +845,20 @@
         <w:bidi/>
         <w:rPr>
           <w:rFonts w:hint="eastAsia"/>
+          <w:highlight w:val="green"/>
         </w:rPr>
       </w:pPr>
       <w:r>
         <w:rPr>
           <w:rFonts w:cs="Times New Roman"/>
+          <w:highlight w:val="green"/>
           <w:rtl/>
         </w:rPr>
         <w:t xml:space="preserve">مشاهده مدرسه‌های نزدیک محل سکونت </w:t>
       </w:r>
       <w:r>
         <w:rPr>
+          <w:highlight w:val="green"/>
           <w:rtl/>
         </w:rPr>
         <w:t>(</w:t>
@@ -850,12 +866,14 @@
       <w:r>
         <w:rPr>
           <w:rFonts w:cs="Times New Roman"/>
+          <w:highlight w:val="green"/>
           <w:rtl/>
         </w:rPr>
         <w:t>اختیاری</w:t>
       </w:r>
       <w:r>
         <w:rPr>
+          <w:highlight w:val="green"/>
           <w:rtl/>
         </w:rPr>
         <w:t>).</w:t>
@@ -1178,16 +1196,9 @@
           <w:rFonts w:hint="eastAsia"/>
         </w:rPr>
       </w:pPr>
-      <w:bookmarkStart w:id="0" w:name="_GoBack"/>
-      <w:bookmarkEnd w:id="0"/>
     </w:p>
     <w:sectPr>
-      <w:headerReference w:type="even" r:id="rId8"/>
-      <w:headerReference w:type="default" r:id="rId9"/>
-      <w:footerReference w:type="even" r:id="rId10"/>
-      <w:footerReference w:type="default" r:id="rId11"/>
-      <w:headerReference w:type="first" r:id="rId12"/>
-      <w:footerReference w:type="first" r:id="rId13"/>
+      <w:footerReference w:type="default" r:id="rId8"/>
       <w:pgSz w:w="12240" w:h="15840"/>
       <w:pgMar w:top="1440" w:right="1800" w:bottom="1440" w:left="1800" w:header="0" w:footer="0" w:gutter="0"/>
       <w:cols w:space="720"/>
@@ -1236,19 +1247,6 @@
       <w:pStyle w:val="Footer"/>
       <w:rPr>
         <w:rFonts w:hint="eastAsia"/>
-      </w:rPr>
-    </w:pPr>
-  </w:p>
-</w:ftr>
-</file>
-
-<file path=word/footer2.xml><?xml version="1.0" encoding="utf-8"?>
-<w:ftr xmlns:wpc="http://schemas.microsoft.com/office/word/2010/wordprocessingCanvas" xmlns:cx="http://schemas.microsoft.com/office/drawing/2014/chartex" xmlns:mc="http://schemas.openxmlformats.org/markup-compatibility/2006" xmlns:o="urn:schemas-microsoft-com:office:office" xmlns:r="http://schemas.openxmlformats.org/officeDocument/2006/relationships" xmlns:m="http://schemas.openxmlformats.org/officeDocument/2006/math" xmlns:v="urn:schemas-microsoft-com:vml" xmlns:wp14="http://schemas.microsoft.com/office/word/2010/wordprocessingDrawing" xmlns:wp="http://schemas.openxmlformats.org/drawingml/2006/wordprocessingDrawing" xmlns:w10="urn:schemas-microsoft-com:office:word" xmlns:w="http://schemas.openxmlformats.org/wordprocessingml/2006/main" xmlns:w14="http://schemas.microsoft.com/office/word/2010/wordml" xmlns:w15="http://schemas.microsoft.com/office/word/2012/wordml" xmlns:w16se="http://schemas.microsoft.com/office/word/2015/wordml/symex" xmlns:wpg="http://schemas.microsoft.com/office/word/2010/wordprocessingGroup" xmlns:wpi="http://schemas.microsoft.com/office/word/2010/wordprocessingInk" xmlns:wne="http://schemas.microsoft.com/office/word/2006/wordml" xmlns:wps="http://schemas.microsoft.com/office/word/2010/wordprocessingShape" mc:Ignorable="w14 w15 w16se wp14">
-  <w:p>
-    <w:pPr>
-      <w:pStyle w:val="Footer"/>
-      <w:rPr>
-        <w:rFonts w:hint="eastAsia"/>
         <w:rtl/>
       </w:rPr>
     </w:pPr>
@@ -1271,19 +1269,6 @@
       </w:rPr>
     </w:pPr>
   </w:p>
-  <w:p>
-    <w:pPr>
-      <w:pStyle w:val="Footer"/>
-      <w:rPr>
-        <w:rFonts w:hint="eastAsia"/>
-      </w:rPr>
-    </w:pPr>
-  </w:p>
-</w:ftr>
-</file>
-
-<file path=word/footer3.xml><?xml version="1.0" encoding="utf-8"?>
-<w:ftr xmlns:wpc="http://schemas.microsoft.com/office/word/2010/wordprocessingCanvas" xmlns:cx="http://schemas.microsoft.com/office/drawing/2014/chartex" xmlns:mc="http://schemas.openxmlformats.org/markup-compatibility/2006" xmlns:o="urn:schemas-microsoft-com:office:office" xmlns:r="http://schemas.openxmlformats.org/officeDocument/2006/relationships" xmlns:m="http://schemas.openxmlformats.org/officeDocument/2006/math" xmlns:v="urn:schemas-microsoft-com:vml" xmlns:wp14="http://schemas.microsoft.com/office/word/2010/wordprocessingDrawing" xmlns:wp="http://schemas.openxmlformats.org/drawingml/2006/wordprocessingDrawing" xmlns:w10="urn:schemas-microsoft-com:office:word" xmlns:w="http://schemas.openxmlformats.org/wordprocessingml/2006/main" xmlns:w14="http://schemas.microsoft.com/office/word/2010/wordml" xmlns:w15="http://schemas.microsoft.com/office/word/2012/wordml" xmlns:w16se="http://schemas.microsoft.com/office/word/2015/wordml/symex" xmlns:wpg="http://schemas.microsoft.com/office/word/2010/wordprocessingGroup" xmlns:wpi="http://schemas.microsoft.com/office/word/2010/wordprocessingInk" xmlns:wne="http://schemas.microsoft.com/office/word/2006/wordml" xmlns:wps="http://schemas.microsoft.com/office/word/2010/wordprocessingShape" mc:Ignorable="w14 w15 w16se wp14">
   <w:p>
     <w:pPr>
       <w:pStyle w:val="Footer"/>
@@ -1324,45 +1309,6 @@
     </w:p>
   </w:footnote>
 </w:footnotes>
-</file>
-
-<file path=word/header1.xml><?xml version="1.0" encoding="utf-8"?>
-<w:hdr xmlns:wpc="http://schemas.microsoft.com/office/word/2010/wordprocessingCanvas" xmlns:cx="http://schemas.microsoft.com/office/drawing/2014/chartex" xmlns:mc="http://schemas.openxmlformats.org/markup-compatibility/2006" xmlns:o="urn:schemas-microsoft-com:office:office" xmlns:r="http://schemas.openxmlformats.org/officeDocument/2006/relationships" xmlns:m="http://schemas.openxmlformats.org/officeDocument/2006/math" xmlns:v="urn:schemas-microsoft-com:vml" xmlns:wp14="http://schemas.microsoft.com/office/word/2010/wordprocessingDrawing" xmlns:wp="http://schemas.openxmlformats.org/drawingml/2006/wordprocessingDrawing" xmlns:w10="urn:schemas-microsoft-com:office:word" xmlns:w="http://schemas.openxmlformats.org/wordprocessingml/2006/main" xmlns:w14="http://schemas.microsoft.com/office/word/2010/wordml" xmlns:w15="http://schemas.microsoft.com/office/word/2012/wordml" xmlns:w16se="http://schemas.microsoft.com/office/word/2015/wordml/symex" xmlns:wpg="http://schemas.microsoft.com/office/word/2010/wordprocessingGroup" xmlns:wpi="http://schemas.microsoft.com/office/word/2010/wordprocessingInk" xmlns:wne="http://schemas.microsoft.com/office/word/2006/wordml" xmlns:wps="http://schemas.microsoft.com/office/word/2010/wordprocessingShape" mc:Ignorable="w14 w15 w16se wp14">
-  <w:p>
-    <w:pPr>
-      <w:pStyle w:val="Header"/>
-      <w:rPr>
-        <w:rFonts w:hint="eastAsia"/>
-      </w:rPr>
-    </w:pPr>
-  </w:p>
-</w:hdr>
-</file>
-
-<file path=word/header2.xml><?xml version="1.0" encoding="utf-8"?>
-<w:hdr xmlns:wpc="http://schemas.microsoft.com/office/word/2010/wordprocessingCanvas" xmlns:cx="http://schemas.microsoft.com/office/drawing/2014/chartex" xmlns:mc="http://schemas.openxmlformats.org/markup-compatibility/2006" xmlns:o="urn:schemas-microsoft-com:office:office" xmlns:r="http://schemas.openxmlformats.org/officeDocument/2006/relationships" xmlns:m="http://schemas.openxmlformats.org/officeDocument/2006/math" xmlns:v="urn:schemas-microsoft-com:vml" xmlns:wp14="http://schemas.microsoft.com/office/word/2010/wordprocessingDrawing" xmlns:wp="http://schemas.openxmlformats.org/drawingml/2006/wordprocessingDrawing" xmlns:w10="urn:schemas-microsoft-com:office:word" xmlns:w="http://schemas.openxmlformats.org/wordprocessingml/2006/main" xmlns:w14="http://schemas.microsoft.com/office/word/2010/wordml" xmlns:w15="http://schemas.microsoft.com/office/word/2012/wordml" xmlns:w16se="http://schemas.microsoft.com/office/word/2015/wordml/symex" xmlns:wpg="http://schemas.microsoft.com/office/word/2010/wordprocessingGroup" xmlns:wpi="http://schemas.microsoft.com/office/word/2010/wordprocessingInk" xmlns:wne="http://schemas.microsoft.com/office/word/2006/wordml" xmlns:wps="http://schemas.microsoft.com/office/word/2010/wordprocessingShape" mc:Ignorable="w14 w15 w16se wp14">
-  <w:p>
-    <w:pPr>
-      <w:pStyle w:val="Header"/>
-      <w:rPr>
-        <w:rFonts w:hint="eastAsia"/>
-      </w:rPr>
-    </w:pPr>
-  </w:p>
-</w:hdr>
-</file>
-
-<file path=word/header3.xml><?xml version="1.0" encoding="utf-8"?>
-<w:hdr xmlns:wpc="http://schemas.microsoft.com/office/word/2010/wordprocessingCanvas" xmlns:cx="http://schemas.microsoft.com/office/drawing/2014/chartex" xmlns:mc="http://schemas.openxmlformats.org/markup-compatibility/2006" xmlns:o="urn:schemas-microsoft-com:office:office" xmlns:r="http://schemas.openxmlformats.org/officeDocument/2006/relationships" xmlns:m="http://schemas.openxmlformats.org/officeDocument/2006/math" xmlns:v="urn:schemas-microsoft-com:vml" xmlns:wp14="http://schemas.microsoft.com/office/word/2010/wordprocessingDrawing" xmlns:wp="http://schemas.openxmlformats.org/drawingml/2006/wordprocessingDrawing" xmlns:w10="urn:schemas-microsoft-com:office:word" xmlns:w="http://schemas.openxmlformats.org/wordprocessingml/2006/main" xmlns:w14="http://schemas.microsoft.com/office/word/2010/wordml" xmlns:w15="http://schemas.microsoft.com/office/word/2012/wordml" xmlns:w16se="http://schemas.microsoft.com/office/word/2015/wordml/symex" xmlns:wpg="http://schemas.microsoft.com/office/word/2010/wordprocessingGroup" xmlns:wpi="http://schemas.microsoft.com/office/word/2010/wordprocessingInk" xmlns:wne="http://schemas.microsoft.com/office/word/2006/wordml" xmlns:wps="http://schemas.microsoft.com/office/word/2010/wordprocessingShape" mc:Ignorable="w14 w15 w16se wp14">
-  <w:p>
-    <w:pPr>
-      <w:pStyle w:val="Header"/>
-      <w:rPr>
-        <w:rFonts w:hint="eastAsia"/>
-      </w:rPr>
-    </w:pPr>
-  </w:p>
-</w:hdr>
 </file>
 
 <file path=word/numbering.xml><?xml version="1.0" encoding="utf-8"?>
@@ -13661,7 +13607,7 @@
 </file>
 
 <file path=customXml/itemProps1.xml><?xml version="1.0" encoding="utf-8"?>
-<ds:datastoreItem xmlns:ds="http://schemas.openxmlformats.org/officeDocument/2006/customXml" ds:itemID="{940C3D01-BF32-4F70-85E9-72657F055CBA}">
+<ds:datastoreItem xmlns:ds="http://schemas.openxmlformats.org/officeDocument/2006/customXml" ds:itemID="{BB10BD2D-2944-4311-BE29-33109CB0A5AD}">
   <ds:schemaRefs>
     <ds:schemaRef ds:uri="http://schemas.openxmlformats.org/officeDocument/2006/bibliography"/>
   </ds:schemaRefs>

</xml_diff>

<commit_message>
improve news receiver retrieve
</commit_message>
<xml_diff>
--- a/Docs/پروژه.docx
+++ b/Docs/پروژه.docx
@@ -143,8 +143,6 @@
         </w:rPr>
         <w:t>.</w:t>
       </w:r>
-      <w:bookmarkStart w:id="0" w:name="_GoBack"/>
-      <w:bookmarkEnd w:id="0"/>
     </w:p>
     <w:p>
       <w:pPr>
@@ -412,17 +410,22 @@
         <w:bidi/>
         <w:rPr>
           <w:rFonts w:hint="eastAsia"/>
-        </w:rPr>
-      </w:pPr>
+          <w:highlight w:val="green"/>
+        </w:rPr>
+      </w:pPr>
+      <w:bookmarkStart w:id="0" w:name="_GoBack"/>
+      <w:bookmarkEnd w:id="0"/>
       <w:r>
         <w:rPr>
           <w:rFonts w:cs="Times New Roman"/>
+          <w:highlight w:val="green"/>
           <w:rtl/>
         </w:rPr>
         <w:t>ایجاد خبر با عنوان و متن خبر</w:t>
       </w:r>
       <w:r>
         <w:rPr>
+          <w:highlight w:val="green"/>
           <w:rtl/>
         </w:rPr>
         <w:t>.</w:t>
@@ -1193,7 +1196,9 @@
     <w:p>
       <w:pPr>
         <w:rPr>
-          <w:rFonts w:hint="eastAsia"/>
+          <w:rFonts w:cs="Arial" w:hint="cs"/>
+          <w:rtl/>
+          <w:lang w:bidi="fa-IR"/>
         </w:rPr>
       </w:pPr>
     </w:p>
@@ -13607,7 +13612,7 @@
 </file>
 
 <file path=customXml/itemProps1.xml><?xml version="1.0" encoding="utf-8"?>
-<ds:datastoreItem xmlns:ds="http://schemas.openxmlformats.org/officeDocument/2006/customXml" ds:itemID="{BB10BD2D-2944-4311-BE29-33109CB0A5AD}">
+<ds:datastoreItem xmlns:ds="http://schemas.openxmlformats.org/officeDocument/2006/customXml" ds:itemID="{30D264E3-27A0-4C15-A084-91059D60200D}">
   <ds:schemaRefs>
     <ds:schemaRef ds:uri="http://schemas.openxmlformats.org/officeDocument/2006/bibliography"/>
   </ds:schemaRefs>

</xml_diff>